<commit_message>
fix(build): đọc nguồn UTF-8 có BOM, khôi phục tiêu đề phiếu chấm
Tệp 02_phieu_cham.md bị ghi kèm BOM nên dòng '# PHIẾU CHẤM...' không nhận
diện là tiêu đề, in ra thành đoạn văn thường kèm dấu #. Đọc bằng utf-8-sig
và bỏ BOM đầu tệp; xuất lại DOCX.
</commit_message>
<xml_diff>
--- a/docs/N24DCDT022_DT011_TranHuuDuy_BaoCao.docx
+++ b/docs/N24DCDT022_DT011_TranHuuDuy_BaoCao.docx
@@ -676,16 +676,16 @@
     </w:p>
     <w:p>
       <w:pPr>
-        <w:ind w:firstLine="567"/>
+        <w:pStyle w:val="Heading1"/>
+        <w:pageBreakBefore/>
       </w:pPr>
       <w:r>
         <w:rPr>
           <w:rFonts w:ascii="Times New Roman" w:hAnsi="Times New Roman" w:cs="Times New Roman" w:eastAsia="Times New Roman"/>
-          <w:b w:val="0"/>
-          <w:i w:val="0"/>
-          <w:sz w:val="26"/>
+          <w:b/>
+          <w:sz w:val="32"/>
         </w:rPr>
-        <w:t>﻿# PHIẾU CHẤM VÀ ĐỐI CHIẾU MINH CHỨNG</w:t>
+        <w:t>PHIẾU CHẤM VÀ ĐỐI CHIẾU MINH CHỨNG</w:t>
       </w:r>
     </w:p>
     <w:p>

</xml_diff>